<commit_message>
modified file with correction of minor errors
</commit_message>
<xml_diff>
--- a/week-1.docx
+++ b/week-1.docx
@@ -27,12 +27,6 @@
         </w:rPr>
         <w:t>Contact Details</w:t>
       </w:r>
-      <w:r>
-        <w:rPr>
-          <w:lang w:val="en-US"/>
-        </w:rPr>
-        <w:t>w</w:t>
-      </w:r>
     </w:p>
     <w:tbl>
       <w:tblPr>
@@ -102,16 +96,14 @@
                 <w:lang w:val="en-US"/>
               </w:rPr>
             </w:pPr>
-            <w:proofErr w:type="spellStart"/>
-            <w:r>
-              <w:rPr>
-                <w:b/>
-                <w:bCs/>
-                <w:lang w:val="en-US"/>
-              </w:rPr>
-              <w:t>Keytype</w:t>
-            </w:r>
-            <w:proofErr w:type="spellEnd"/>
+            <w:r>
+              <w:rPr>
+                <w:b/>
+                <w:bCs/>
+                <w:lang w:val="en-US"/>
+              </w:rPr>
+              <w:t>Key type</w:t>
+            </w:r>
           </w:p>
         </w:tc>
       </w:tr>
@@ -131,7 +123,13 @@
               <w:rPr>
                 <w:lang w:val="en-US"/>
               </w:rPr>
-              <w:t>Phone_no</w:t>
+              <w:t>p</w:t>
+            </w:r>
+            <w:r>
+              <w:rPr>
+                <w:lang w:val="en-US"/>
+              </w:rPr>
+              <w:t>hone_no</w:t>
             </w:r>
             <w:proofErr w:type="spellEnd"/>
           </w:p>
@@ -370,16 +368,14 @@
                 <w:lang w:val="en-US"/>
               </w:rPr>
             </w:pPr>
-            <w:proofErr w:type="spellStart"/>
-            <w:r>
-              <w:rPr>
-                <w:b/>
-                <w:bCs/>
-                <w:lang w:val="en-US"/>
-              </w:rPr>
-              <w:t>Keytype</w:t>
-            </w:r>
-            <w:proofErr w:type="spellEnd"/>
+            <w:r>
+              <w:rPr>
+                <w:b/>
+                <w:bCs/>
+                <w:lang w:val="en-US"/>
+              </w:rPr>
+              <w:t>Key type</w:t>
+            </w:r>
           </w:p>
         </w:tc>
       </w:tr>
@@ -466,7 +462,7 @@
               <w:rPr>
                 <w:lang w:val="en-US"/>
               </w:rPr>
-              <w:t>VARCHAR2(15)</w:t>
+              <w:t>NUM</w:t>
             </w:r>
           </w:p>
         </w:tc>
@@ -672,16 +668,14 @@
                 <w:lang w:val="en-US"/>
               </w:rPr>
             </w:pPr>
-            <w:proofErr w:type="spellStart"/>
-            <w:r>
-              <w:rPr>
-                <w:b/>
-                <w:bCs/>
-                <w:lang w:val="en-US"/>
-              </w:rPr>
-              <w:t>Keytype</w:t>
-            </w:r>
-            <w:proofErr w:type="spellEnd"/>
+            <w:r>
+              <w:rPr>
+                <w:b/>
+                <w:bCs/>
+                <w:lang w:val="en-US"/>
+              </w:rPr>
+              <w:t>Key type</w:t>
+            </w:r>
           </w:p>
         </w:tc>
       </w:tr>
@@ -701,7 +695,13 @@
               <w:rPr>
                 <w:lang w:val="en-US"/>
               </w:rPr>
-              <w:t>Address_no</w:t>
+              <w:t>House</w:t>
+            </w:r>
+            <w:r>
+              <w:rPr>
+                <w:lang w:val="en-US"/>
+              </w:rPr>
+              <w:t>_no</w:t>
             </w:r>
             <w:proofErr w:type="spellEnd"/>
           </w:p>
@@ -720,7 +720,7 @@
               <w:rPr>
                 <w:lang w:val="en-US"/>
               </w:rPr>
-              <w:t>INT</w:t>
+              <w:t>NUM</w:t>
             </w:r>
           </w:p>
         </w:tc>
@@ -880,7 +880,7 @@
               <w:rPr>
                 <w:lang w:val="en-US"/>
               </w:rPr>
-              <w:t>INT</w:t>
+              <w:t>NUM</w:t>
             </w:r>
           </w:p>
         </w:tc>
@@ -918,19 +918,6 @@
         <w:t>Identity</w:t>
       </w:r>
     </w:p>
-    <w:p>
-      <w:pPr>
-        <w:rPr>
-          <w:lang w:val="en-US"/>
-        </w:rPr>
-      </w:pPr>
-      <w:r>
-        <w:rPr>
-          <w:lang w:val="en-US"/>
-        </w:rPr>
-        <w:t>Education</w:t>
-      </w:r>
-    </w:p>
     <w:tbl>
       <w:tblPr>
         <w:tblStyle w:val="TableGrid"/>
@@ -999,16 +986,14 @@
                 <w:lang w:val="en-US"/>
               </w:rPr>
             </w:pPr>
-            <w:proofErr w:type="spellStart"/>
-            <w:r>
-              <w:rPr>
-                <w:b/>
-                <w:bCs/>
-                <w:lang w:val="en-US"/>
-              </w:rPr>
-              <w:t>Keytype</w:t>
-            </w:r>
-            <w:proofErr w:type="spellEnd"/>
+            <w:r>
+              <w:rPr>
+                <w:b/>
+                <w:bCs/>
+                <w:lang w:val="en-US"/>
+              </w:rPr>
+              <w:t>Key type</w:t>
+            </w:r>
           </w:p>
         </w:tc>
       </w:tr>
@@ -1047,7 +1032,7 @@
               <w:rPr>
                 <w:lang w:val="en-US"/>
               </w:rPr>
-              <w:t>INT</w:t>
+              <w:t>NUM</w:t>
             </w:r>
           </w:p>
         </w:tc>
@@ -1309,16 +1294,14 @@
                 <w:lang w:val="en-US"/>
               </w:rPr>
             </w:pPr>
-            <w:proofErr w:type="spellStart"/>
-            <w:r>
-              <w:rPr>
-                <w:b/>
-                <w:bCs/>
-                <w:lang w:val="en-US"/>
-              </w:rPr>
-              <w:t>Keytype</w:t>
-            </w:r>
-            <w:proofErr w:type="spellEnd"/>
+            <w:r>
+              <w:rPr>
+                <w:b/>
+                <w:bCs/>
+                <w:lang w:val="en-US"/>
+              </w:rPr>
+              <w:t>Key type</w:t>
+            </w:r>
           </w:p>
         </w:tc>
       </w:tr>
@@ -1411,7 +1394,7 @@
               <w:rPr>
                 <w:lang w:val="en-US"/>
               </w:rPr>
-              <w:t>INT</w:t>
+              <w:t>NUM</w:t>
             </w:r>
           </w:p>
         </w:tc>
@@ -1462,7 +1445,13 @@
               <w:rPr>
                 <w:lang w:val="en-US"/>
               </w:rPr>
-              <w:t>DECIMAL(</w:t>
+              <w:t>NUM</w:t>
+            </w:r>
+            <w:r>
+              <w:rPr>
+                <w:lang w:val="en-US"/>
+              </w:rPr>
+              <w:t>(</w:t>
             </w:r>
             <w:proofErr w:type="gramEnd"/>
             <w:r>
@@ -1487,13 +1476,6 @@
         </w:tc>
       </w:tr>
     </w:tbl>
-    <w:p>
-      <w:pPr>
-        <w:rPr>
-          <w:lang w:val="en-US"/>
-        </w:rPr>
-      </w:pPr>
-    </w:p>
     <w:p>
       <w:pPr>
         <w:rPr>

</xml_diff>

<commit_message>
Fix minor errors in week-1.docx
</commit_message>
<xml_diff>
--- a/week-1.docx
+++ b/week-1.docx
@@ -250,19 +250,7 @@
               <w:rPr>
                 <w:lang w:val="en-US"/>
               </w:rPr>
-              <w:t>VARCHAR2(</w:t>
-            </w:r>
-            <w:r>
-              <w:rPr>
-                <w:lang w:val="en-US"/>
-              </w:rPr>
-              <w:t>50</w:t>
-            </w:r>
-            <w:r>
-              <w:rPr>
-                <w:lang w:val="en-US"/>
-              </w:rPr>
-              <w:t>)</w:t>
+              <w:t>VARCHAR2(50)</w:t>
             </w:r>
           </w:p>
         </w:tc>
@@ -464,6 +452,12 @@
               </w:rPr>
               <w:t>NUM</w:t>
             </w:r>
+            <w:r>
+              <w:rPr>
+                <w:lang w:val="en-US"/>
+              </w:rPr>
+              <w:t>BER</w:t>
+            </w:r>
           </w:p>
         </w:tc>
         <w:tc>
@@ -722,6 +716,12 @@
               </w:rPr>
               <w:t>NUM</w:t>
             </w:r>
+            <w:r>
+              <w:rPr>
+                <w:lang w:val="en-US"/>
+              </w:rPr>
+              <w:t>BER</w:t>
+            </w:r>
           </w:p>
         </w:tc>
         <w:tc>
@@ -1034,6 +1034,12 @@
               </w:rPr>
               <w:t>NUM</w:t>
             </w:r>
+            <w:r>
+              <w:rPr>
+                <w:lang w:val="en-US"/>
+              </w:rPr>
+              <w:t>BER</w:t>
+            </w:r>
           </w:p>
         </w:tc>
         <w:tc>
@@ -1320,13 +1326,7 @@
               <w:rPr>
                 <w:lang w:val="en-US"/>
               </w:rPr>
-              <w:t>P</w:t>
-            </w:r>
-            <w:r>
-              <w:rPr>
-                <w:lang w:val="en-US"/>
-              </w:rPr>
-              <w:t>osition</w:t>
+              <w:t>Position</w:t>
             </w:r>
           </w:p>
         </w:tc>
@@ -1395,6 +1395,12 @@
                 <w:lang w:val="en-US"/>
               </w:rPr>
               <w:t>NUM</w:t>
+            </w:r>
+            <w:r>
+              <w:rPr>
+                <w:lang w:val="en-US"/>
+              </w:rPr>
+              <w:t>BER</w:t>
             </w:r>
           </w:p>
         </w:tc>

</xml_diff>